<commit_message>
feat(deploy): deteksi beda skema server vs lokal (Bandingkan Skema)
Mendeteksi kolom/tabel yang HILANG di server (mis. migrasi belum jalan) atau
berlebih — lebih dalam dari sekadar status migrasi.

- App\Support\SchemaSnapshot: capture() (introspeksi Schema::getColumns, driver-
  agnostic) + diff() (missing/extra tabel & kolom; beda tipe soft, tak gagalkan sync).
- Perintah `schema:snapshot` → database/schema-snapshot.json (skema lokal referensi,
  ikut git; regenerasi tiap ubah migrasi).
- Endpoint POST deploy-tools/schema-diff: server bandingkan skema live vs snapshot.
- UI tab Deploy: tombol "Bandingkan Skema" + panel hasil (kolom/tabel hilang → merah).
- Uji: SchemaSnapshotTest (5 unit) + DeployToolsTest schema-diff; dist.zip di-rebuild.

Co-Authored-By: Claude Opus 4.8 (1M context) <noreply@anthropic.com>
</commit_message>
<xml_diff>
--- a/docs/Langkah-Langkah Deploy.docx
+++ b/docs/Langkah-Langkah Deploy.docx
@@ -630,6 +630,70 @@
       <w:r>
         <w:rPr/>
         <w:t xml:space="preserve">DB terhubung, bukan maintenance, symlink storage ada.</w:t>
+      </w:r>
+    </w:p>
+    <w:p>
+      <w:r>
+        <w:rPr/>
+        <w:t xml:space="preserve">Untuk memastikan lebih dalam, tekan </w:t>
+      </w:r>
+      <w:r>
+        <w:rPr>
+          <w:b/>
+        </w:rPr>
+        <w:t xml:space="preserve">Bandingkan Skema</w:t>
+      </w:r>
+      <w:r>
+        <w:rPr/>
+        <w:t xml:space="preserve"> — membandingkan kolom/tabel DB</w:t>
+      </w:r>
+    </w:p>
+    <w:p>
+      <w:r>
+        <w:rPr/>
+        <w:t xml:space="preserve">server dengan snapshot lokal, lalu menampilkan kolom/tabel yang </w:t>
+      </w:r>
+      <w:r>
+        <w:rPr>
+          <w:b/>
+        </w:rPr>
+        <w:t xml:space="preserve">belum ada di server</w:t>
+      </w:r>
+    </w:p>
+    <w:p>
+      <w:r>
+        <w:rPr/>
+        <w:t xml:space="preserve">(bila ada). "Skema server = lokal" berarti struktur database sudah persis sama.</w:t>
+      </w:r>
+    </w:p>
+    <w:p>
+      <w:pPr>
+        <w:ind w:left="340"/>
+        <w:pBdr>
+          <w:left w:val="single" w:sz="18" w:space="8" w:color="BFBFBF"/>
+        </w:pBdr>
+      </w:pPr>
+      <w:r>
+        <w:rPr>
+          <w:i/>
+          <w:color w:val="595959"/>
+        </w:rPr>
+        <w:t xml:space="preserve">Snapshot skema dibuat di LOKAL dengan `php artisan schema:snapshot` (file</w:t>
+      </w:r>
+    </w:p>
+    <w:p>
+      <w:pPr>
+        <w:ind w:left="340"/>
+        <w:pBdr>
+          <w:left w:val="single" w:sz="18" w:space="8" w:color="BFBFBF"/>
+        </w:pBdr>
+      </w:pPr>
+      <w:r>
+        <w:rPr>
+          <w:i/>
+          <w:color w:val="595959"/>
+        </w:rPr>
+        <w:t xml:space="preserve">`database/schema-snapshot.json`, ikut git) — regenerasi tiap menambah/ubah migrasi.</w:t>
       </w:r>
     </w:p>
     <w:p>

</xml_diff>